<commit_message>
Update gitignore and add project files
</commit_message>
<xml_diff>
--- a/function_test_automation_university.docx
+++ b/function_test_automation_university.docx
@@ -586,17 +586,7 @@
           <w:b/>
           <w:bCs/>
         </w:rPr>
-        <w:t>&amp; Expected Re</w:t>
-      </w:r>
-      <w:bookmarkStart w:id="0" w:name="_GoBack"/>
-      <w:bookmarkEnd w:id="0"/>
-      <w:r>
-        <w:rPr>
-          <w:rFonts w:ascii="Fira Code" w:hAnsi="Fira Code" w:cs="Fira Code"/>
-          <w:b/>
-          <w:bCs/>
-        </w:rPr>
-        <w:t>sult</w:t>
+        <w:t>&amp; Expected Result</w:t>
       </w:r>
       <w:r>
         <w:rPr>
@@ -1147,14 +1137,7 @@
           <w:rFonts w:ascii="Fira Code" w:hAnsi="Fira Code" w:cs="Fira Code"/>
           <w:rtl/>
         </w:rPr>
-        <w:t xml:space="preserve"> </w:t>
-      </w:r>
-      <w:r>
-        <w:rPr>
-          <w:rFonts w:ascii="Fira Code" w:hAnsi="Fira Code" w:cs="Fira Code"/>
-          <w:rtl/>
-        </w:rPr>
-        <w:t>(</w:t>
+        <w:t xml:space="preserve"> (</w:t>
       </w:r>
       <w:r>
         <w:rPr>
@@ -1489,14 +1472,7 @@
           <w:rFonts w:ascii="Fira Code" w:hAnsi="Fira Code" w:cs="Fira Code"/>
           <w:rtl/>
         </w:rPr>
-        <w:t xml:space="preserve"> </w:t>
-      </w:r>
-      <w:r>
-        <w:rPr>
-          <w:rFonts w:ascii="Fira Code" w:hAnsi="Fira Code" w:cs="Fira Code"/>
-          <w:rtl/>
-        </w:rPr>
-        <w:t>.</w:t>
+        <w:t xml:space="preserve"> .</w:t>
       </w:r>
     </w:p>
     <w:p>
@@ -5005,7 +4981,7 @@
       <w:pPr>
         <w:bidi/>
         <w:rPr>
-          <w:rFonts w:ascii="Fira Code" w:hAnsi="Fira Code" w:cstheme="minorBidi" w:hint="cs"/>
+          <w:rFonts w:ascii="Fira Code" w:hAnsi="Fira Code" w:cstheme="minorBidi"/>
           <w:rtl/>
         </w:rPr>
       </w:pPr>
@@ -5014,22 +4990,1068 @@
       <w:pPr>
         <w:bidi/>
         <w:rPr>
-          <w:rFonts w:ascii="Fira Code" w:hAnsi="Fira Code" w:cstheme="minorBidi" w:hint="cs"/>
-          <w:b/>
-          <w:bCs/>
-          <w:rtl/>
-        </w:rPr>
-      </w:pPr>
+          <w:rFonts w:ascii="Fira Code" w:hAnsi="Fira Code" w:cs="Fira Code"/>
+          <w:rtl/>
+        </w:rPr>
+      </w:pPr>
+      <w:r>
+        <w:rPr>
+          <w:rFonts w:hint="cs"/>
+          <w:rtl/>
+        </w:rPr>
+        <w:t>פונקציות</w:t>
+      </w:r>
+      <w:r>
+        <w:rPr>
+          <w:rFonts w:ascii="Fira Code" w:hAnsi="Fira Code" w:cs="Fira Code"/>
+          <w:rtl/>
+        </w:rPr>
+        <w:t xml:space="preserve"> </w:t>
+      </w:r>
+      <w:r>
+        <w:rPr>
+          <w:rFonts w:hint="cs"/>
+          <w:rtl/>
+        </w:rPr>
+        <w:t>מאפשרות</w:t>
+      </w:r>
+      <w:r>
+        <w:rPr>
+          <w:rFonts w:ascii="Fira Code" w:hAnsi="Fira Code" w:cs="Fira Code"/>
+          <w:rtl/>
+        </w:rPr>
+        <w:t xml:space="preserve"> </w:t>
+      </w:r>
+      <w:r>
+        <w:rPr>
+          <w:rFonts w:hint="cs"/>
+          <w:rtl/>
+        </w:rPr>
+        <w:t>לנו</w:t>
+      </w:r>
+      <w:r>
+        <w:rPr>
+          <w:rFonts w:ascii="Fira Code" w:hAnsi="Fira Code" w:cs="Fira Code"/>
+          <w:rtl/>
+        </w:rPr>
+        <w:t xml:space="preserve"> </w:t>
+      </w:r>
+      <w:r>
+        <w:rPr>
+          <w:rFonts w:hint="cs"/>
+          <w:rtl/>
+        </w:rPr>
+        <w:t>שימוש</w:t>
+      </w:r>
+      <w:r>
+        <w:rPr>
+          <w:rFonts w:ascii="Fira Code" w:hAnsi="Fira Code" w:cs="Fira Code"/>
+          <w:rtl/>
+        </w:rPr>
+        <w:t xml:space="preserve"> </w:t>
+      </w:r>
+      <w:r>
+        <w:rPr>
+          <w:rFonts w:hint="cs"/>
+          <w:rtl/>
+        </w:rPr>
+        <w:t>חוזר</w:t>
+      </w:r>
+      <w:r>
+        <w:rPr>
+          <w:rFonts w:ascii="Fira Code" w:hAnsi="Fira Code" w:cs="Fira Code"/>
+          <w:rtl/>
+        </w:rPr>
+        <w:t xml:space="preserve"> </w:t>
+      </w:r>
+      <w:r>
+        <w:rPr>
+          <w:rFonts w:hint="cs"/>
+          <w:rtl/>
+        </w:rPr>
+        <w:t>ומודולריות</w:t>
+      </w:r>
+      <w:r>
+        <w:rPr>
+          <w:rFonts w:ascii="Fira Code" w:hAnsi="Fira Code" w:cs="Fira Code"/>
+          <w:rtl/>
+        </w:rPr>
+        <w:t xml:space="preserve"> ,</w:t>
+      </w:r>
+      <w:r>
+        <w:rPr>
+          <w:rFonts w:hint="cs"/>
+          <w:rtl/>
+        </w:rPr>
+        <w:t>לאורך</w:t>
+      </w:r>
+      <w:r>
+        <w:rPr>
+          <w:rFonts w:ascii="Fira Code" w:hAnsi="Fira Code" w:cs="Fira Code"/>
+          <w:rtl/>
+        </w:rPr>
+        <w:t xml:space="preserve"> </w:t>
+      </w:r>
+      <w:r>
+        <w:rPr>
+          <w:rFonts w:hint="cs"/>
+          <w:rtl/>
+        </w:rPr>
+        <w:t>הקוד</w:t>
+      </w:r>
+      <w:r>
+        <w:rPr>
+          <w:rFonts w:ascii="Fira Code" w:hAnsi="Fira Code" w:cs="Fira Code"/>
+          <w:rtl/>
+        </w:rPr>
+        <w:t>.</w:t>
+      </w:r>
     </w:p>
     <w:p>
       <w:pPr>
-        <w:rPr>
-          <w:rFonts w:hint="cs"/>
-        </w:rPr>
-      </w:pPr>
+        <w:bidi/>
+        <w:rPr>
+          <w:rFonts w:ascii="Fira Code" w:hAnsi="Fira Code" w:cstheme="minorBidi"/>
+          <w:rtl/>
+        </w:rPr>
+      </w:pPr>
+    </w:p>
+    <w:p>
+      <w:pPr>
+        <w:bidi/>
+        <w:rPr>
+          <w:rFonts w:ascii="Fira Code" w:hAnsi="Fira Code" w:cstheme="minorBidi"/>
+          <w:rtl/>
+        </w:rPr>
+      </w:pPr>
+    </w:p>
+    <w:p>
+      <w:pPr>
+        <w:bidi/>
+        <w:rPr>
+          <w:rFonts w:ascii="Fira Code" w:hAnsi="Fira Code" w:cstheme="minorBidi"/>
+          <w:rtl/>
+        </w:rPr>
+      </w:pPr>
+    </w:p>
+    <w:p>
+      <w:pPr>
+        <w:bidi/>
+        <w:rPr>
+          <w:rFonts w:ascii="Fira Code" w:hAnsi="Fira Code" w:cstheme="minorBidi"/>
+          <w:rtl/>
+        </w:rPr>
+      </w:pPr>
+    </w:p>
+    <w:p>
+      <w:pPr>
+        <w:bidi/>
+        <w:rPr>
+          <w:rFonts w:ascii="Fira Code" w:hAnsi="Fira Code" w:cstheme="minorBidi"/>
+          <w:rtl/>
+        </w:rPr>
+        <w:sectPr>
+          <w:headerReference w:type="default" r:id="rId8"/>
+          <w:pgSz w:w="11906" w:h="16838"/>
+          <w:pgMar w:top="1440" w:right="1800" w:bottom="1440" w:left="1800" w:header="720" w:footer="720" w:gutter="0"/>
+          <w:cols w:space="720"/>
+          <w:bidi/>
+          <w:rtlGutter/>
+          <w:docGrid w:linePitch="360"/>
+        </w:sectPr>
+      </w:pPr>
+    </w:p>
+    <w:p>
+      <w:pPr>
+        <w:bidi/>
+        <w:rPr>
+          <w:rFonts w:ascii="Fira Code" w:hAnsi="Fira Code" w:cs="Fira Code"/>
+          <w:rtl/>
+        </w:rPr>
+      </w:pPr>
+      <w:r>
+        <w:rPr>
+          <w:rFonts w:hint="cs"/>
+          <w:rtl/>
+        </w:rPr>
+        <w:t>בכל</w:t>
+      </w:r>
+      <w:r>
+        <w:rPr>
+          <w:rFonts w:ascii="Fira Code" w:hAnsi="Fira Code" w:cs="Fira Code"/>
+          <w:rtl/>
+        </w:rPr>
+        <w:t xml:space="preserve"> </w:t>
+      </w:r>
+      <w:r>
+        <w:rPr>
+          <w:rFonts w:hint="cs"/>
+          <w:rtl/>
+        </w:rPr>
+        <w:t>פונקציה</w:t>
+      </w:r>
+      <w:r>
+        <w:rPr>
+          <w:rFonts w:ascii="Fira Code" w:hAnsi="Fira Code" w:cs="Fira Code"/>
+          <w:rtl/>
+        </w:rPr>
+        <w:t xml:space="preserve"> </w:t>
+      </w:r>
+      <w:r>
+        <w:rPr>
+          <w:rFonts w:hint="cs"/>
+          <w:rtl/>
+        </w:rPr>
+        <w:t>יש</w:t>
+      </w:r>
+      <w:r>
+        <w:rPr>
+          <w:rFonts w:ascii="Fira Code" w:hAnsi="Fira Code" w:cs="Fira Code"/>
+          <w:rtl/>
+        </w:rPr>
+        <w:t xml:space="preserve"> </w:t>
+      </w:r>
+      <w:r>
+        <w:rPr>
+          <w:rFonts w:hint="cs"/>
+          <w:rtl/>
+        </w:rPr>
+        <w:t>לנו</w:t>
+      </w:r>
+      <w:r>
+        <w:rPr>
+          <w:rFonts w:ascii="Fira Code" w:hAnsi="Fira Code" w:cs="Fira Code"/>
+          <w:rtl/>
+        </w:rPr>
+        <w:t xml:space="preserve"> </w:t>
+      </w:r>
+      <w:r>
+        <w:rPr>
+          <w:rFonts w:hint="cs"/>
+          <w:rtl/>
+        </w:rPr>
+        <w:t>את</w:t>
+      </w:r>
+      <w:r>
+        <w:rPr>
+          <w:rFonts w:ascii="Fira Code" w:hAnsi="Fira Code" w:cs="Fira Code"/>
+          <w:rtl/>
+        </w:rPr>
+        <w:t xml:space="preserve"> </w:t>
+      </w:r>
+      <w:r>
+        <w:rPr>
+          <w:rFonts w:hint="cs"/>
+          <w:rtl/>
+        </w:rPr>
+        <w:t>האותיות</w:t>
+      </w:r>
+      <w:r>
+        <w:rPr>
+          <w:rFonts w:ascii="Fira Code" w:hAnsi="Fira Code" w:cs="Fira Code"/>
+          <w:rtl/>
+        </w:rPr>
+        <w:t xml:space="preserve"> </w:t>
+      </w:r>
+      <w:r>
+        <w:rPr>
+          <w:rFonts w:ascii="Fira Code" w:hAnsi="Fira Code" w:cs="Fira Code"/>
+        </w:rPr>
+        <w:t>def</w:t>
+      </w:r>
+      <w:r>
+        <w:rPr>
+          <w:rFonts w:ascii="Fira Code" w:hAnsi="Fira Code" w:cs="Fira Code"/>
+          <w:rtl/>
+        </w:rPr>
+        <w:t xml:space="preserve"> ,</w:t>
+      </w:r>
+      <w:r>
+        <w:rPr>
+          <w:rFonts w:hint="cs"/>
+          <w:rtl/>
+        </w:rPr>
+        <w:t>שם</w:t>
+      </w:r>
+      <w:r>
+        <w:rPr>
+          <w:rFonts w:ascii="Fira Code" w:hAnsi="Fira Code" w:cs="Fira Code"/>
+          <w:rtl/>
+        </w:rPr>
+        <w:t xml:space="preserve"> </w:t>
+      </w:r>
+      <w:r>
+        <w:rPr>
+          <w:rFonts w:hint="cs"/>
+          <w:rtl/>
+        </w:rPr>
+        <w:t>ייחודי</w:t>
+      </w:r>
+      <w:r>
+        <w:rPr>
+          <w:rFonts w:ascii="Fira Code" w:hAnsi="Fira Code" w:cs="Fira Code"/>
+          <w:rtl/>
+        </w:rPr>
+        <w:t xml:space="preserve"> </w:t>
+      </w:r>
+      <w:r>
+        <w:rPr>
+          <w:rFonts w:hint="cs"/>
+          <w:rtl/>
+        </w:rPr>
+        <w:t>לפונקציה</w:t>
+      </w:r>
+      <w:r>
+        <w:rPr>
+          <w:rFonts w:ascii="Fira Code" w:hAnsi="Fira Code" w:cs="Fira Code"/>
+          <w:rtl/>
+        </w:rPr>
+        <w:t xml:space="preserve"> ,</w:t>
+      </w:r>
+    </w:p>
+    <w:p>
+      <w:pPr>
+        <w:bidi/>
+        <w:rPr>
+          <w:rFonts w:ascii="Fira Code" w:hAnsi="Fira Code" w:cs="Fira Code"/>
+          <w:rtl/>
+        </w:rPr>
+      </w:pPr>
+      <w:r>
+        <w:rPr>
+          <w:rFonts w:hint="cs"/>
+          <w:rtl/>
+        </w:rPr>
+        <w:t>יש</w:t>
+      </w:r>
+      <w:r>
+        <w:rPr>
+          <w:rFonts w:ascii="Fira Code" w:hAnsi="Fira Code" w:cs="Fira Code"/>
+          <w:rtl/>
+        </w:rPr>
+        <w:t xml:space="preserve"> </w:t>
+      </w:r>
+      <w:r>
+        <w:rPr>
+          <w:rFonts w:hint="cs"/>
+          <w:rtl/>
+        </w:rPr>
+        <w:t>לנו</w:t>
+      </w:r>
+      <w:r>
+        <w:rPr>
+          <w:rFonts w:ascii="Fira Code" w:hAnsi="Fira Code" w:cs="Fira Code"/>
+          <w:rtl/>
+        </w:rPr>
+        <w:t xml:space="preserve"> </w:t>
+      </w:r>
+      <w:r>
+        <w:rPr>
+          <w:rFonts w:hint="cs"/>
+          <w:rtl/>
+        </w:rPr>
+        <w:t>את</w:t>
+      </w:r>
+      <w:r>
+        <w:rPr>
+          <w:rFonts w:ascii="Fira Code" w:hAnsi="Fira Code" w:cs="Fira Code"/>
+          <w:rtl/>
+        </w:rPr>
+        <w:t xml:space="preserve"> </w:t>
+      </w:r>
+      <w:r>
+        <w:rPr>
+          <w:rFonts w:hint="cs"/>
+          <w:rtl/>
+        </w:rPr>
+        <w:t>הסוגריים</w:t>
+      </w:r>
+      <w:r>
+        <w:rPr>
+          <w:rFonts w:ascii="Fira Code" w:hAnsi="Fira Code" w:cs="Fira Code"/>
+          <w:rtl/>
+        </w:rPr>
+        <w:t xml:space="preserve"> </w:t>
+      </w:r>
+      <w:r>
+        <w:rPr>
+          <w:rFonts w:hint="cs"/>
+          <w:rtl/>
+        </w:rPr>
+        <w:t>ואת</w:t>
+      </w:r>
+      <w:r>
+        <w:rPr>
+          <w:rFonts w:ascii="Fira Code" w:hAnsi="Fira Code" w:cs="Fira Code"/>
+          <w:rtl/>
+        </w:rPr>
+        <w:t xml:space="preserve"> </w:t>
+      </w:r>
+      <w:r>
+        <w:rPr>
+          <w:rFonts w:hint="cs"/>
+          <w:rtl/>
+        </w:rPr>
+        <w:t>הנקודתיים</w:t>
+      </w:r>
+      <w:r>
+        <w:rPr>
+          <w:rFonts w:ascii="Fira Code" w:hAnsi="Fira Code" w:cs="Fira Code"/>
+          <w:rtl/>
+        </w:rPr>
+        <w:t>.</w:t>
+      </w:r>
+    </w:p>
+    <w:p>
+      <w:pPr>
+        <w:bidi/>
+        <w:rPr>
+          <w:rFonts w:ascii="Fira Code" w:hAnsi="Fira Code" w:cs="Fira Code"/>
+          <w:rtl/>
+        </w:rPr>
+      </w:pPr>
+      <w:r>
+        <w:rPr>
+          <w:rFonts w:ascii="Fira Code" w:hAnsi="Fira Code" w:cs="Fira Code"/>
+          <w:noProof/>
+        </w:rPr>
+        <w:drawing>
+          <wp:anchor distT="0" distB="0" distL="114300" distR="114300" simplePos="0" relativeHeight="251659264" behindDoc="0" locked="1" layoutInCell="1" allowOverlap="0">
+            <wp:simplePos x="0" y="0"/>
+            <wp:positionH relativeFrom="page">
+              <wp:align>center</wp:align>
+            </wp:positionH>
+            <wp:positionV relativeFrom="page">
+              <wp:posOffset>2476500</wp:posOffset>
+            </wp:positionV>
+            <wp:extent cx="2990088" cy="1563624"/>
+            <wp:effectExtent l="19050" t="19050" r="20320" b="17780"/>
+            <wp:wrapSquare wrapText="bothSides"/>
+            <wp:docPr id="2" name="Picture 2"/>
+            <wp:cNvGraphicFramePr>
+              <a:graphicFrameLocks xmlns:a="http://schemas.openxmlformats.org/drawingml/2006/main" noChangeAspect="1"/>
+            </wp:cNvGraphicFramePr>
+            <a:graphic xmlns:a="http://schemas.openxmlformats.org/drawingml/2006/main">
+              <a:graphicData uri="http://schemas.openxmlformats.org/drawingml/2006/picture">
+                <pic:pic xmlns:pic="http://schemas.openxmlformats.org/drawingml/2006/picture">
+                  <pic:nvPicPr>
+                    <pic:cNvPr id="1" name=""/>
+                    <pic:cNvPicPr/>
+                  </pic:nvPicPr>
+                  <pic:blipFill>
+                    <a:blip r:embed="rId9" cstate="print">
+                      <a:extLst>
+                        <a:ext uri="{28A0092B-C50C-407E-A947-70E740481C1C}">
+                          <a14:useLocalDpi xmlns:a14="http://schemas.microsoft.com/office/drawing/2010/main" val="0"/>
+                        </a:ext>
+                      </a:extLst>
+                    </a:blip>
+                    <a:stretch>
+                      <a:fillRect/>
+                    </a:stretch>
+                  </pic:blipFill>
+                  <pic:spPr>
+                    <a:xfrm>
+                      <a:off x="0" y="0"/>
+                      <a:ext cx="2990088" cy="1563624"/>
+                    </a:xfrm>
+                    <a:prstGeom prst="rect">
+                      <a:avLst/>
+                    </a:prstGeom>
+                    <a:ln w="25400">
+                      <a:solidFill>
+                        <a:srgbClr val="92D050"/>
+                      </a:solidFill>
+                    </a:ln>
+                  </pic:spPr>
+                </pic:pic>
+              </a:graphicData>
+            </a:graphic>
+            <wp14:sizeRelH relativeFrom="margin">
+              <wp14:pctWidth>0</wp14:pctWidth>
+            </wp14:sizeRelH>
+            <wp14:sizeRelV relativeFrom="margin">
+              <wp14:pctHeight>0</wp14:pctHeight>
+            </wp14:sizeRelV>
+          </wp:anchor>
+        </w:drawing>
+      </w:r>
+    </w:p>
+    <w:p>
+      <w:pPr>
+        <w:bidi/>
+        <w:rPr>
+          <w:rFonts w:ascii="Fira Code" w:hAnsi="Fira Code" w:cs="Fira Code"/>
+          <w:rtl/>
+        </w:rPr>
+      </w:pPr>
+    </w:p>
+    <w:p>
+      <w:pPr>
+        <w:bidi/>
+        <w:rPr>
+          <w:rFonts w:ascii="Fira Code" w:hAnsi="Fira Code" w:cs="Fira Code"/>
+          <w:rtl/>
+        </w:rPr>
+      </w:pPr>
+    </w:p>
+    <w:p>
+      <w:pPr>
+        <w:bidi/>
+        <w:rPr>
+          <w:rFonts w:ascii="Fira Code" w:hAnsi="Fira Code" w:cs="Fira Code"/>
+          <w:rtl/>
+        </w:rPr>
+      </w:pPr>
+    </w:p>
+    <w:p>
+      <w:pPr>
+        <w:bidi/>
+        <w:rPr>
+          <w:rFonts w:ascii="Fira Code" w:hAnsi="Fira Code" w:cs="Fira Code"/>
+          <w:rtl/>
+        </w:rPr>
+      </w:pPr>
+    </w:p>
+    <w:p>
+      <w:pPr>
+        <w:bidi/>
+        <w:rPr>
+          <w:rFonts w:ascii="Fira Code" w:hAnsi="Fira Code" w:cs="Fira Code"/>
+          <w:rtl/>
+        </w:rPr>
+      </w:pPr>
+    </w:p>
+    <w:p>
+      <w:pPr>
+        <w:bidi/>
+        <w:rPr>
+          <w:rFonts w:ascii="Fira Code" w:hAnsi="Fira Code" w:cs="Fira Code"/>
+          <w:rtl/>
+        </w:rPr>
+      </w:pPr>
+    </w:p>
+    <w:p>
+      <w:pPr>
+        <w:bidi/>
+        <w:rPr>
+          <w:rFonts w:ascii="Fira Code" w:hAnsi="Fira Code" w:cs="Fira Code"/>
+          <w:rtl/>
+        </w:rPr>
+      </w:pPr>
+    </w:p>
+    <w:p>
+      <w:pPr>
+        <w:bidi/>
+        <w:rPr>
+          <w:rFonts w:ascii="Fira Code" w:hAnsi="Fira Code" w:cs="Fira Code"/>
+          <w:rtl/>
+        </w:rPr>
+      </w:pPr>
+    </w:p>
+    <w:p>
+      <w:pPr>
+        <w:bidi/>
+        <w:rPr>
+          <w:rFonts w:ascii="Fira Code" w:hAnsi="Fira Code" w:cs="Fira Code"/>
+          <w:rtl/>
+        </w:rPr>
+      </w:pPr>
+    </w:p>
+    <w:p>
+      <w:pPr>
+        <w:bidi/>
+        <w:rPr>
+          <w:rFonts w:ascii="Fira Code" w:hAnsi="Fira Code" w:cs="Fira Code" w:hint="cs"/>
+          <w:rtl/>
+        </w:rPr>
+      </w:pPr>
+      <w:r>
+        <w:rPr>
+          <w:rFonts w:hint="cs"/>
+          <w:rtl/>
+        </w:rPr>
+        <w:t>גוף</w:t>
+      </w:r>
+      <w:r>
+        <w:rPr>
+          <w:rFonts w:ascii="Fira Code" w:hAnsi="Fira Code" w:cs="Fira Code"/>
+          <w:rtl/>
+        </w:rPr>
+        <w:t xml:space="preserve"> </w:t>
+      </w:r>
+      <w:r>
+        <w:rPr>
+          <w:rFonts w:hint="cs"/>
+          <w:rtl/>
+        </w:rPr>
+        <w:t>הפונקציה</w:t>
+      </w:r>
+      <w:r>
+        <w:rPr>
+          <w:rFonts w:ascii="Fira Code" w:hAnsi="Fira Code" w:cs="Fira Code"/>
+          <w:rtl/>
+        </w:rPr>
+        <w:t xml:space="preserve"> </w:t>
+      </w:r>
+      <w:r>
+        <w:rPr>
+          <w:rFonts w:hint="cs"/>
+          <w:rtl/>
+        </w:rPr>
+        <w:t>שלנו</w:t>
+      </w:r>
+      <w:r>
+        <w:rPr>
+          <w:rFonts w:ascii="Fira Code" w:hAnsi="Fira Code" w:cs="Fira Code"/>
+          <w:rtl/>
+        </w:rPr>
+        <w:t xml:space="preserve"> </w:t>
+      </w:r>
+      <w:r>
+        <w:rPr>
+          <w:rFonts w:hint="cs"/>
+          <w:rtl/>
+        </w:rPr>
+        <w:t>תמיד</w:t>
+      </w:r>
+      <w:r>
+        <w:rPr>
+          <w:rFonts w:ascii="Fira Code" w:hAnsi="Fira Code" w:cs="Fira Code"/>
+          <w:rtl/>
+        </w:rPr>
+        <w:t xml:space="preserve"> </w:t>
+      </w:r>
+      <w:proofErr w:type="spellStart"/>
+      <w:r>
+        <w:rPr>
+          <w:rFonts w:hint="cs"/>
+          <w:rtl/>
+        </w:rPr>
+        <w:t>מוזח</w:t>
+      </w:r>
+      <w:proofErr w:type="spellEnd"/>
+      <w:r>
+        <w:rPr>
+          <w:rFonts w:ascii="Fira Code" w:hAnsi="Fira Code" w:cs="Fira Code"/>
+          <w:rtl/>
+        </w:rPr>
+        <w:t xml:space="preserve"> </w:t>
+      </w:r>
+      <w:r>
+        <w:rPr>
+          <w:rFonts w:hint="cs"/>
+          <w:rtl/>
+        </w:rPr>
+        <w:t>פנימה</w:t>
+      </w:r>
+      <w:r>
+        <w:rPr>
+          <w:rFonts w:ascii="Fira Code" w:hAnsi="Fira Code" w:cs="Fira Code"/>
+          <w:rtl/>
+        </w:rPr>
+        <w:t xml:space="preserve"> </w:t>
+      </w:r>
+      <w:r>
+        <w:rPr>
+          <w:rFonts w:hint="cs"/>
+          <w:rtl/>
+        </w:rPr>
+        <w:t>בארבעה</w:t>
+      </w:r>
+      <w:r>
+        <w:rPr>
+          <w:rFonts w:ascii="Fira Code" w:hAnsi="Fira Code" w:cs="Fira Code"/>
+          <w:rtl/>
+        </w:rPr>
+        <w:t xml:space="preserve"> </w:t>
+      </w:r>
+      <w:r>
+        <w:rPr>
+          <w:rFonts w:hint="cs"/>
+          <w:rtl/>
+        </w:rPr>
+        <w:t>רווחים</w:t>
+      </w:r>
+      <w:r>
+        <w:rPr>
+          <w:rFonts w:ascii="Fira Code" w:hAnsi="Fira Code" w:cs="Fira Code"/>
+          <w:rtl/>
+        </w:rPr>
+        <w:t xml:space="preserve">, </w:t>
+      </w:r>
+      <w:r>
+        <w:rPr>
+          <w:rFonts w:hint="cs"/>
+          <w:rtl/>
+        </w:rPr>
+        <w:t>ואנחנו</w:t>
+      </w:r>
+      <w:r>
+        <w:rPr>
+          <w:rFonts w:ascii="Fira Code" w:hAnsi="Fira Code" w:cs="Fira Code"/>
+          <w:rtl/>
+        </w:rPr>
+        <w:t xml:space="preserve"> </w:t>
+      </w:r>
+      <w:r>
+        <w:rPr>
+          <w:rFonts w:hint="cs"/>
+          <w:rtl/>
+        </w:rPr>
+        <w:t>מסירים</w:t>
+      </w:r>
+      <w:r>
+        <w:rPr>
+          <w:rFonts w:ascii="Fira Code" w:hAnsi="Fira Code" w:cs="Fira Code"/>
+          <w:rtl/>
+        </w:rPr>
+        <w:t xml:space="preserve"> </w:t>
+      </w:r>
+      <w:r>
+        <w:rPr>
+          <w:rFonts w:hint="cs"/>
+          <w:rtl/>
+        </w:rPr>
+        <w:t>את</w:t>
+      </w:r>
+      <w:r>
+        <w:rPr>
+          <w:rFonts w:ascii="Fira Code" w:hAnsi="Fira Code" w:cs="Fira Code"/>
+          <w:rtl/>
+        </w:rPr>
+        <w:t xml:space="preserve"> </w:t>
+      </w:r>
+      <w:r>
+        <w:rPr>
+          <w:rFonts w:hint="cs"/>
+          <w:rtl/>
+        </w:rPr>
+        <w:t>הרווחים</w:t>
+      </w:r>
+      <w:r>
+        <w:rPr>
+          <w:rFonts w:ascii="Fira Code" w:hAnsi="Fira Code" w:cs="Fira Code"/>
+          <w:rtl/>
+        </w:rPr>
+        <w:t xml:space="preserve"> </w:t>
+      </w:r>
+      <w:r>
+        <w:rPr>
+          <w:rFonts w:hint="cs"/>
+          <w:rtl/>
+        </w:rPr>
+        <w:t>כשאנחנו</w:t>
+      </w:r>
+      <w:r>
+        <w:rPr>
+          <w:rFonts w:ascii="Fira Code" w:hAnsi="Fira Code" w:cs="Fira Code"/>
+          <w:rtl/>
+        </w:rPr>
+        <w:t xml:space="preserve"> </w:t>
+      </w:r>
+      <w:r>
+        <w:rPr>
+          <w:rFonts w:hint="cs"/>
+          <w:rtl/>
+        </w:rPr>
+        <w:t>רוצים</w:t>
+      </w:r>
+      <w:r>
+        <w:rPr>
+          <w:rFonts w:ascii="Fira Code" w:hAnsi="Fira Code" w:cs="Fira Code"/>
+          <w:rtl/>
+        </w:rPr>
+        <w:t xml:space="preserve"> </w:t>
+      </w:r>
+      <w:r>
+        <w:rPr>
+          <w:rFonts w:hint="cs"/>
+          <w:rtl/>
+        </w:rPr>
+        <w:t>לקרוא</w:t>
+      </w:r>
+      <w:r>
+        <w:rPr>
+          <w:rFonts w:ascii="Fira Code" w:hAnsi="Fira Code" w:cs="Fira Code"/>
+          <w:rtl/>
+        </w:rPr>
+        <w:t xml:space="preserve"> </w:t>
+      </w:r>
+      <w:r>
+        <w:rPr>
+          <w:rFonts w:hint="cs"/>
+          <w:rtl/>
+        </w:rPr>
+        <w:t>לפונקציה</w:t>
+      </w:r>
+      <w:r>
+        <w:rPr>
+          <w:rFonts w:ascii="Fira Code" w:hAnsi="Fira Code" w:cs="Fira Code" w:hint="cs"/>
+          <w:rtl/>
+        </w:rPr>
+        <w:t>.</w:t>
+      </w:r>
+    </w:p>
+    <w:p>
+      <w:pPr>
+        <w:bidi/>
+        <w:rPr>
+          <w:rFonts w:ascii="Fira Code" w:hAnsi="Fira Code" w:cs="Fira Code"/>
+          <w:rtl/>
+        </w:rPr>
+      </w:pPr>
+      <w:r>
+        <w:rPr>
+          <w:rtl/>
+        </w:rPr>
+        <w:t>אנחנו נשתמש בשם הייחודי ובסוגריים כדי לקרוא לפונקציה</w:t>
+      </w:r>
+      <w:r>
+        <w:t>.</w:t>
+      </w:r>
+    </w:p>
+    <w:p>
+      <w:pPr>
+        <w:bidi/>
+        <w:rPr>
+          <w:rFonts w:ascii="Fira Code" w:hAnsi="Fira Code" w:cs="Fira Code"/>
+        </w:rPr>
+      </w:pPr>
+      <w:r>
+        <w:rPr>
+          <w:noProof/>
+        </w:rPr>
+        <w:drawing>
+          <wp:anchor distT="0" distB="0" distL="114300" distR="114300" simplePos="0" relativeHeight="251661312" behindDoc="0" locked="1" layoutInCell="1" allowOverlap="0">
+            <wp:simplePos x="0" y="0"/>
+            <wp:positionH relativeFrom="page">
+              <wp:align>center</wp:align>
+            </wp:positionH>
+            <wp:positionV relativeFrom="page">
+              <wp:posOffset>6134100</wp:posOffset>
+            </wp:positionV>
+            <wp:extent cx="5020056" cy="246888"/>
+            <wp:effectExtent l="19050" t="19050" r="9525" b="20320"/>
+            <wp:wrapSquare wrapText="bothSides"/>
+            <wp:docPr id="4" name="Picture 4"/>
+            <wp:cNvGraphicFramePr>
+              <a:graphicFrameLocks xmlns:a="http://schemas.openxmlformats.org/drawingml/2006/main" noChangeAspect="1"/>
+            </wp:cNvGraphicFramePr>
+            <a:graphic xmlns:a="http://schemas.openxmlformats.org/drawingml/2006/main">
+              <a:graphicData uri="http://schemas.openxmlformats.org/drawingml/2006/picture">
+                <pic:pic xmlns:pic="http://schemas.openxmlformats.org/drawingml/2006/picture">
+                  <pic:nvPicPr>
+                    <pic:cNvPr id="1" name=""/>
+                    <pic:cNvPicPr/>
+                  </pic:nvPicPr>
+                  <pic:blipFill>
+                    <a:blip r:embed="rId10">
+                      <a:extLst>
+                        <a:ext uri="{28A0092B-C50C-407E-A947-70E740481C1C}">
+                          <a14:useLocalDpi xmlns:a14="http://schemas.microsoft.com/office/drawing/2010/main" val="0"/>
+                        </a:ext>
+                      </a:extLst>
+                    </a:blip>
+                    <a:stretch>
+                      <a:fillRect/>
+                    </a:stretch>
+                  </pic:blipFill>
+                  <pic:spPr>
+                    <a:xfrm>
+                      <a:off x="0" y="0"/>
+                      <a:ext cx="5020056" cy="246888"/>
+                    </a:xfrm>
+                    <a:prstGeom prst="rect">
+                      <a:avLst/>
+                    </a:prstGeom>
+                    <a:ln w="25400">
+                      <a:solidFill>
+                        <a:srgbClr val="FFCCCC"/>
+                      </a:solidFill>
+                    </a:ln>
+                  </pic:spPr>
+                </pic:pic>
+              </a:graphicData>
+            </a:graphic>
+            <wp14:sizeRelH relativeFrom="margin">
+              <wp14:pctWidth>0</wp14:pctWidth>
+            </wp14:sizeRelH>
+            <wp14:sizeRelV relativeFrom="margin">
+              <wp14:pctHeight>0</wp14:pctHeight>
+            </wp14:sizeRelV>
+          </wp:anchor>
+        </w:drawing>
+      </w:r>
+      <w:r>
+        <w:rPr>
+          <w:noProof/>
+        </w:rPr>
+        <w:t xml:space="preserve"> </w:t>
+      </w:r>
+      <w:r>
+        <w:rPr>
+          <w:noProof/>
+        </w:rPr>
+        <w:drawing>
+          <wp:anchor distT="0" distB="0" distL="114300" distR="114300" simplePos="0" relativeHeight="251660288" behindDoc="0" locked="1" layoutInCell="1" allowOverlap="0">
+            <wp:simplePos x="0" y="0"/>
+            <wp:positionH relativeFrom="page">
+              <wp:posOffset>1590675</wp:posOffset>
+            </wp:positionH>
+            <wp:positionV relativeFrom="page">
+              <wp:posOffset>4486275</wp:posOffset>
+            </wp:positionV>
+            <wp:extent cx="1562100" cy="1511300"/>
+            <wp:effectExtent l="19050" t="19050" r="19050" b="12700"/>
+            <wp:wrapSquare wrapText="bothSides"/>
+            <wp:docPr id="3" name="Picture 3"/>
+            <wp:cNvGraphicFramePr>
+              <a:graphicFrameLocks xmlns:a="http://schemas.openxmlformats.org/drawingml/2006/main" noChangeAspect="1"/>
+            </wp:cNvGraphicFramePr>
+            <a:graphic xmlns:a="http://schemas.openxmlformats.org/drawingml/2006/main">
+              <a:graphicData uri="http://schemas.openxmlformats.org/drawingml/2006/picture">
+                <pic:pic xmlns:pic="http://schemas.openxmlformats.org/drawingml/2006/picture">
+                  <pic:nvPicPr>
+                    <pic:cNvPr id="1" name=""/>
+                    <pic:cNvPicPr/>
+                  </pic:nvPicPr>
+                  <pic:blipFill>
+                    <a:blip r:embed="rId11">
+                      <a:extLst>
+                        <a:ext uri="{28A0092B-C50C-407E-A947-70E740481C1C}">
+                          <a14:useLocalDpi xmlns:a14="http://schemas.microsoft.com/office/drawing/2010/main" val="0"/>
+                        </a:ext>
+                      </a:extLst>
+                    </a:blip>
+                    <a:stretch>
+                      <a:fillRect/>
+                    </a:stretch>
+                  </pic:blipFill>
+                  <pic:spPr>
+                    <a:xfrm>
+                      <a:off x="0" y="0"/>
+                      <a:ext cx="1562100" cy="1511300"/>
+                    </a:xfrm>
+                    <a:prstGeom prst="rect">
+                      <a:avLst/>
+                    </a:prstGeom>
+                    <a:ln w="25400">
+                      <a:solidFill>
+                        <a:srgbClr val="FF00FF"/>
+                      </a:solidFill>
+                    </a:ln>
+                  </pic:spPr>
+                </pic:pic>
+              </a:graphicData>
+            </a:graphic>
+            <wp14:sizeRelH relativeFrom="margin">
+              <wp14:pctWidth>0</wp14:pctWidth>
+            </wp14:sizeRelH>
+            <wp14:sizeRelV relativeFrom="margin">
+              <wp14:pctHeight>0</wp14:pctHeight>
+            </wp14:sizeRelV>
+          </wp:anchor>
+        </w:drawing>
+      </w:r>
+    </w:p>
+    <w:p>
+      <w:pPr>
+        <w:bidi/>
+        <w:rPr>
+          <w:rFonts w:ascii="Fira Code" w:hAnsi="Fira Code" w:cstheme="minorBidi" w:hint="cs"/>
+          <w:rtl/>
+        </w:rPr>
+      </w:pPr>
+    </w:p>
+    <w:p>
+      <w:pPr>
+        <w:bidi/>
+        <w:rPr>
+          <w:rFonts w:ascii="Fira Code" w:hAnsi="Fira Code" w:cstheme="minorBidi"/>
+          <w:b/>
+          <w:bCs/>
+          <w:rtl/>
+        </w:rPr>
+      </w:pPr>
+    </w:p>
+    <w:p/>
+    <w:p/>
+    <w:p/>
+    <w:p/>
+    <w:p/>
+    <w:p/>
+    <w:p>
+      <w:pPr>
+        <w:jc w:val="right"/>
+      </w:pPr>
+    </w:p>
+    <w:p/>
+    <w:p/>
+    <w:p/>
+    <w:p/>
+    <w:p/>
+    <w:p/>
+    <w:p/>
+    <w:p/>
+    <w:p/>
+    <w:p/>
+    <w:p>
+      <w:pPr>
+        <w:bidi/>
+        <w:rPr>
+          <w:rtl/>
+        </w:rPr>
+        <w:sectPr>
+          <w:headerReference w:type="default" r:id="rId12"/>
+          <w:pgSz w:w="11906" w:h="16838"/>
+          <w:pgMar w:top="1440" w:right="1800" w:bottom="1440" w:left="1800" w:header="720" w:footer="720" w:gutter="0"/>
+          <w:cols w:space="720"/>
+          <w:bidi/>
+          <w:rtlGutter/>
+          <w:docGrid w:linePitch="360"/>
+        </w:sectPr>
+      </w:pPr>
+    </w:p>
+    <w:p>
+      <w:pPr>
+        <w:bidi/>
+      </w:pPr>
+      <w:r>
+        <w:rPr>
+          <w:rtl/>
+        </w:rPr>
+        <w:t xml:space="preserve">אין לנו </w:t>
+      </w:r>
+      <w:r>
+        <w:rPr>
+          <w:rtl/>
+        </w:rPr>
+        <w:t>דרך לקבל קלט מהמשתמש בצורה גמישה</w:t>
+      </w:r>
+      <w:r>
+        <w:rPr>
+          <w:rtl/>
+        </w:rPr>
+        <w:t xml:space="preserve"> באמת, אז זה לא כמו מחשבון אמית</w:t>
+      </w:r>
+      <w:r>
+        <w:t>.</w:t>
+      </w:r>
+    </w:p>
+    <w:p>
+      <w:pPr>
+        <w:bidi/>
+        <w:rPr>
+          <w:rFonts w:hint="cs"/>
+          <w:rtl/>
+        </w:rPr>
+      </w:pPr>
+      <w:bookmarkStart w:id="0" w:name="_GoBack"/>
+      <w:bookmarkEnd w:id="0"/>
     </w:p>
     <w:sectPr>
-      <w:headerReference w:type="default" r:id="rId8"/>
+      <w:headerReference w:type="default" r:id="rId13"/>
       <w:pgSz w:w="11906" w:h="16838"/>
       <w:pgMar w:top="1440" w:right="1800" w:bottom="1440" w:left="1800" w:header="720" w:footer="720" w:gutter="0"/>
       <w:cols w:space="720"/>
@@ -5099,6 +6121,111 @@
         <w:color w:val="FF00FF"/>
       </w:rPr>
       <w:t>function</w:t>
+    </w:r>
+  </w:p>
+  <w:p>
+    <w:pPr>
+      <w:pStyle w:val="IntenseQuote"/>
+      <w:bidi/>
+      <w:rPr>
+        <w:rFonts w:ascii="Fira Code" w:hAnsi="Fira Code" w:cs="Fira Code"/>
+        <w:b/>
+        <w:bCs/>
+        <w:color w:val="FF00FF"/>
+      </w:rPr>
+    </w:pPr>
+    <w:hyperlink r:id="rId1" w:history="1">
+      <w:r>
+        <w:rPr>
+          <w:rFonts w:ascii="Fira Code" w:hAnsi="Fira Code" w:cs="Fira Code"/>
+          <w:b/>
+          <w:bCs/>
+          <w:color w:val="FF00FF"/>
+        </w:rPr>
+        <w:t>https://testautomationu.applitools.com/learningpaths.html?id=python-testing-path</w:t>
+      </w:r>
+    </w:hyperlink>
+  </w:p>
+</w:hdr>
+</file>
+
+<file path=word/header2.xml><?xml version="1.0" encoding="utf-8"?>
+<w:hdr xmlns:wpc="http://schemas.microsoft.com/office/word/2010/wordprocessingCanvas" xmlns:cx="http://schemas.microsoft.com/office/drawing/2014/chartex" xmlns:cx1="http://schemas.microsoft.com/office/drawing/2015/9/8/chartex" xmlns:mc="http://schemas.openxmlformats.org/markup-compatibility/2006" xmlns:o="urn:schemas-microsoft-com:office:office" xmlns:r="http://schemas.openxmlformats.org/officeDocument/2006/relationships" xmlns:m="http://schemas.openxmlformats.org/officeDocument/2006/math" xmlns:v="urn:schemas-microsoft-com:vml" xmlns:wp14="http://schemas.microsoft.com/office/word/2010/wordprocessingDrawing" xmlns:wp="http://schemas.openxmlformats.org/drawingml/2006/wordprocessingDrawing" xmlns:w10="urn:schemas-microsoft-com:office:word" xmlns:w="http://schemas.openxmlformats.org/wordprocessingml/2006/main" xmlns:w14="http://schemas.microsoft.com/office/word/2010/wordml" xmlns:w15="http://schemas.microsoft.com/office/word/2012/wordml" xmlns:w16se="http://schemas.microsoft.com/office/word/2015/wordml/symex" xmlns:wpg="http://schemas.microsoft.com/office/word/2010/wordprocessingGroup" xmlns:wpi="http://schemas.microsoft.com/office/word/2010/wordprocessingInk" xmlns:wne="http://schemas.microsoft.com/office/word/2006/wordml" xmlns:wps="http://schemas.microsoft.com/office/word/2010/wordprocessingShape" mc:Ignorable="w14 w15 w16se wp14">
+  <w:p>
+    <w:pPr>
+      <w:pStyle w:val="IntenseQuote"/>
+      <w:rPr>
+        <w:rFonts w:ascii="Fira Code" w:hAnsi="Fira Code" w:cs="Fira Code"/>
+        <w:b/>
+        <w:bCs/>
+        <w:color w:val="FF00FF"/>
+      </w:rPr>
+    </w:pPr>
+    <w:r>
+      <w:rPr>
+        <w:rFonts w:ascii="Fira Code" w:hAnsi="Fira Code" w:cs="Fira Code"/>
+        <w:b/>
+        <w:bCs/>
+        <w:color w:val="FF00FF"/>
+      </w:rPr>
+      <w:t>Function – Parts of a Function</w:t>
+    </w:r>
+  </w:p>
+  <w:p>
+    <w:pPr>
+      <w:pStyle w:val="IntenseQuote"/>
+      <w:bidi/>
+      <w:rPr>
+        <w:rFonts w:ascii="Fira Code" w:hAnsi="Fira Code" w:cs="Fira Code"/>
+        <w:b/>
+        <w:bCs/>
+        <w:color w:val="FF00FF"/>
+      </w:rPr>
+    </w:pPr>
+    <w:hyperlink r:id="rId1" w:history="1">
+      <w:r>
+        <w:rPr>
+          <w:rFonts w:ascii="Fira Code" w:hAnsi="Fira Code" w:cs="Fira Code"/>
+          <w:b/>
+          <w:bCs/>
+          <w:color w:val="FF00FF"/>
+        </w:rPr>
+        <w:t>https://testautomationu.applitools.com/learningpaths.html?id=python-testing-path</w:t>
+      </w:r>
+    </w:hyperlink>
+  </w:p>
+</w:hdr>
+</file>
+
+<file path=word/header3.xml><?xml version="1.0" encoding="utf-8"?>
+<w:hdr xmlns:wpc="http://schemas.microsoft.com/office/word/2010/wordprocessingCanvas" xmlns:cx="http://schemas.microsoft.com/office/drawing/2014/chartex" xmlns:cx1="http://schemas.microsoft.com/office/drawing/2015/9/8/chartex" xmlns:mc="http://schemas.openxmlformats.org/markup-compatibility/2006" xmlns:o="urn:schemas-microsoft-com:office:office" xmlns:r="http://schemas.openxmlformats.org/officeDocument/2006/relationships" xmlns:m="http://schemas.openxmlformats.org/officeDocument/2006/math" xmlns:v="urn:schemas-microsoft-com:vml" xmlns:wp14="http://schemas.microsoft.com/office/word/2010/wordprocessingDrawing" xmlns:wp="http://schemas.openxmlformats.org/drawingml/2006/wordprocessingDrawing" xmlns:w10="urn:schemas-microsoft-com:office:word" xmlns:w="http://schemas.openxmlformats.org/wordprocessingml/2006/main" xmlns:w14="http://schemas.microsoft.com/office/word/2010/wordml" xmlns:w15="http://schemas.microsoft.com/office/word/2012/wordml" xmlns:w16se="http://schemas.microsoft.com/office/word/2015/wordml/symex" xmlns:wpg="http://schemas.microsoft.com/office/word/2010/wordprocessingGroup" xmlns:wpi="http://schemas.microsoft.com/office/word/2010/wordprocessingInk" xmlns:wne="http://schemas.microsoft.com/office/word/2006/wordml" xmlns:wps="http://schemas.microsoft.com/office/word/2010/wordprocessingShape" mc:Ignorable="w14 w15 w16se wp14">
+  <w:p>
+    <w:pPr>
+      <w:pStyle w:val="IntenseQuote"/>
+      <w:rPr>
+        <w:rFonts w:ascii="Fira Code" w:hAnsi="Fira Code" w:cs="Fira Code"/>
+        <w:b/>
+        <w:bCs/>
+        <w:color w:val="FF00FF"/>
+      </w:rPr>
+    </w:pPr>
+    <w:r>
+      <w:rPr>
+        <w:rFonts w:ascii="Fira Code" w:hAnsi="Fira Code" w:cs="Fira Code"/>
+        <w:b/>
+        <w:bCs/>
+        <w:color w:val="FF00FF"/>
+      </w:rPr>
+      <w:t>Function – Ge</w:t>
+    </w:r>
+    <w:r>
+      <w:rPr>
+        <w:rFonts w:ascii="Fira Code" w:hAnsi="Fira Code" w:cs="Fira Code"/>
+        <w:b/>
+        <w:bCs/>
+        <w:color w:val="FF00FF"/>
+      </w:rPr>
+      <w:t>tting User Input</w:t>
     </w:r>
   </w:p>
   <w:p>

</xml_diff>